<commit_message>
feat(ui): estandarizar termino de rol a 'Cliente Particular' en vistas, README y reporte
</commit_message>
<xml_diff>
--- a/Finanzas Trabajo Parcial.docx
+++ b/Finanzas Trabajo Parcial.docx
@@ -25655,7 +25655,7 @@
         <w:rPr>
           <w:sz w:val="20"/>
         </w:rPr>
-        <w:t>Constituye el punto de acceso inicial a la plataforma. Permite la autenticación segura de usuarios mediante credenciales encriptadas (SHA-256) y delimita los permisos de navegación según el rol asignado (Administrador del Sistema, Administrador de Tienda o Cliente Vecino).</w:t>
+        <w:t>Constituye el punto de acceso inicial a la plataforma. Permite la autenticación segura de usuarios mediante credenciales encriptadas (SHA-256) y delimita los permisos de navegación según el rol asignado (Administrador del Sistema, Administrador de Tienda o Cliente Particular).</w:t>
       </w:r>
     </w:p>
     <w:p>
@@ -25945,7 +25945,7 @@
         <w:rPr>
           <w:sz w:val="19"/>
         </w:rPr>
-        <w:t>Pestañas para alternar entre perfil 'Cliente' o 'Comercio Independiente'.</w:t>
+        <w:t>Selectores para alternar entre perfil 'Cliente Particular' o 'Dueño de Comercio'.</w:t>
       </w:r>
     </w:p>
     <w:p>
@@ -28073,7 +28073,7 @@
           <w:color w:val="C8102E"/>
           <w:sz w:val="25"/>
         </w:rPr>
-        <w:t>6.b.10. Portal de Autoservicio del Cliente Vecino y Calendario de Cuotas</w:t>
+        <w:t>6.b.10. Portal de Autoservicio del Cliente Particular y Calendario de Cuotas</w:t>
       </w:r>
     </w:p>
     <w:p>
@@ -28092,7 +28092,7 @@
         <w:rPr>
           <w:sz w:val="20"/>
         </w:rPr>
-        <w:t>Interfaz diseñada para que el cliente vecino consulte con total transparencia desde su teléfono móvil o computadora el estado de su cuenta corriente, sus compras registradas, su cupo disponible y el cronograma de amortización francesa de sus créditos en cuotas.</w:t>
+        <w:t>Interfaz diseñada para que el cliente particular consulte con total transparencia desde su teléfono móvil o computadora el estado de su cuenta corriente, sus compras registradas, su cupo disponible y el cronograma de amortización francesa de sus créditos en cuotas.</w:t>
       </w:r>
     </w:p>
     <w:p>
@@ -28278,7 +28278,7 @@
                 <w:color w:val="C8102E"/>
                 <w:sz w:val="20"/>
               </w:rPr>
-              <w:t>[ESPACIO RESERVADO PARA IMAGEN 6.b.10: PORTAL DE AUTOSERVICIO DEL CLIENTE VECINO Y CALENDARIO DE CUOTAS]</w:t>
+              <w:t>[ESPACIO RESERVADO PARA IMAGEN 6.b.10: PORTAL DE AUTOSERVICIO DEL CLIENTE PARTICULAR Y CALENDARIO DE CUOTAS]</w:t>
             </w:r>
           </w:p>
           <w:p>
@@ -28308,7 +28308,7 @@
           <w:color w:val="464646"/>
           <w:sz w:val="18"/>
         </w:rPr>
-        <w:t>Figura 6.b.10: Portal de Autoservicio del Cliente Vecino y Calendario de Cuotas - Consulta transparente de línea de crédito, deuda actual y cronograma francés.</w:t>
+        <w:t>Figura 6.b.10: Portal de Autoservicio del Cliente Particular y Calendario de Cuotas - Consulta transparente de línea de crédito, deuda actual y cronograma francés.</w:t>
       </w:r>
     </w:p>
     <w:p>
@@ -33028,7 +33028,7 @@
           <w:b/>
           <w:sz w:val="19"/>
         </w:rPr>
-        <w:t xml:space="preserve">Cliente Vecino: </w:t>
+        <w:t xml:space="preserve">Cliente Particular: </w:t>
       </w:r>
       <w:r>
         <w:rPr>

</xml_diff>